<commit_message>
Documentación finalizada por completo
</commit_message>
<xml_diff>
--- a/documentacion/Recaudación de requisitos y boceto - Bungalo APP.docx
+++ b/documentacion/Recaudación de requisitos y boceto - Bungalo APP.docx
@@ -278,6 +278,15 @@
     </w:p>
     <w:sdt>
       <w:sdtPr>
+        <w:rPr>
+          <w:rFonts w:asciiTheme="minorHAnsi" w:eastAsiaTheme="minorHAnsi" w:hAnsiTheme="minorHAnsi" w:cstheme="minorBidi"/>
+          <w:color w:val="auto"/>
+          <w:kern w:val="2"/>
+          <w:sz w:val="24"/>
+          <w:szCs w:val="24"/>
+          <w:lang w:eastAsia="en-US"/>
+          <w14:ligatures w14:val="standardContextual"/>
+        </w:rPr>
         <w:id w:val="376593266"/>
         <w:docPartObj>
           <w:docPartGallery w:val="Table of Contents"/>
@@ -286,15 +295,8 @@
       </w:sdtPr>
       <w:sdtEndPr>
         <w:rPr>
-          <w:rFonts w:asciiTheme="minorHAnsi" w:eastAsiaTheme="minorHAnsi" w:hAnsiTheme="minorHAnsi" w:cstheme="minorBidi"/>
           <w:b/>
           <w:bCs/>
-          <w:color w:val="auto"/>
-          <w:kern w:val="2"/>
-          <w:sz w:val="24"/>
-          <w:szCs w:val="24"/>
-          <w:lang w:eastAsia="en-US"/>
-          <w14:ligatures w14:val="standardContextual"/>
         </w:rPr>
       </w:sdtEndPr>
       <w:sdtContent>
@@ -1707,6 +1709,9 @@
     <w:p/>
     <w:p>
       <w:r>
+        <w:rPr>
+          <w:noProof/>
+        </w:rPr>
         <w:drawing>
           <wp:inline distT="0" distB="0" distL="0" distR="0" wp14:anchorId="4D18272E" wp14:editId="678D76DD">
             <wp:extent cx="3088640" cy="1957366"/>
@@ -1746,6 +1751,9 @@
     </w:p>
     <w:p>
       <w:r>
+        <w:rPr>
+          <w:noProof/>
+        </w:rPr>
         <w:lastRenderedPageBreak/>
         <w:drawing>
           <wp:inline distT="0" distB="0" distL="0" distR="0" wp14:anchorId="68CDAD64" wp14:editId="22D60C1D">
@@ -1827,6 +1835,9 @@
     </w:p>
     <w:p>
       <w:r>
+        <w:rPr>
+          <w:noProof/>
+        </w:rPr>
         <w:drawing>
           <wp:inline distT="0" distB="0" distL="0" distR="0" wp14:anchorId="4C54CA58" wp14:editId="4E38AD6A">
             <wp:extent cx="4105857" cy="2817707"/>
@@ -1914,6 +1925,9 @@
     </w:p>
     <w:p>
       <w:r>
+        <w:rPr>
+          <w:noProof/>
+        </w:rPr>
         <w:drawing>
           <wp:inline distT="0" distB="0" distL="0" distR="0" wp14:anchorId="0311CC5C" wp14:editId="305CAE9B">
             <wp:extent cx="4030899" cy="2174240"/>
@@ -1979,6 +1993,7 @@
       <w:r>
         <w:rPr>
           <w:rStyle w:val="nfasis"/>
+          <w:noProof/>
         </w:rPr>
         <w:lastRenderedPageBreak/>
         <w:drawing>
@@ -2038,6 +2053,9 @@
         </w:drawing>
       </w:r>
       <w:r>
+        <w:rPr>
+          <w:noProof/>
+        </w:rPr>
         <w:drawing>
           <wp:inline distT="0" distB="0" distL="0" distR="0" wp14:anchorId="0B5495F4" wp14:editId="4D2372DB">
             <wp:extent cx="3718560" cy="2310982"/>
@@ -2251,6 +2269,9 @@
     </w:p>
     <w:p>
       <w:r>
+        <w:rPr>
+          <w:noProof/>
+        </w:rPr>
         <w:drawing>
           <wp:inline distT="0" distB="0" distL="0" distR="0" wp14:anchorId="37D26665" wp14:editId="05D2619D">
             <wp:extent cx="3577281" cy="3803175"/>
@@ -2290,6 +2311,9 @@
     </w:p>
     <w:p>
       <w:r>
+        <w:rPr>
+          <w:noProof/>
+        </w:rPr>
         <w:drawing>
           <wp:inline distT="0" distB="0" distL="0" distR="0" wp14:anchorId="55EBB526" wp14:editId="171E2285">
             <wp:extent cx="3336325" cy="3403020"/>
@@ -2367,6 +2391,9 @@
     </w:p>
     <w:p>
       <w:r>
+        <w:rPr>
+          <w:noProof/>
+        </w:rPr>
         <w:drawing>
           <wp:inline distT="0" distB="0" distL="0" distR="0" wp14:anchorId="4EB3AE6E" wp14:editId="059925E5">
             <wp:extent cx="4024742" cy="3515497"/>
@@ -2445,6 +2472,9 @@
     <w:p/>
     <w:p>
       <w:r>
+        <w:rPr>
+          <w:noProof/>
+        </w:rPr>
         <w:drawing>
           <wp:inline distT="0" distB="0" distL="0" distR="0" wp14:anchorId="3F0819E2" wp14:editId="1C008A1B">
             <wp:extent cx="5202195" cy="2213869"/>
@@ -2498,6 +2528,148 @@
       </w:r>
       <w:r>
         <w:t>para la creación de un empleado nuevo habrá un formulario que se podrá rellenar y registrar al nuevo empleado.</w:t>
+      </w:r>
+    </w:p>
+    <w:p>
+      <w:pPr>
+        <w:jc w:val="center"/>
+      </w:pPr>
+    </w:p>
+    <w:p>
+      <w:pPr>
+        <w:pStyle w:val="Ttulo2"/>
+        <w:numPr>
+          <w:ilvl w:val="1"/>
+          <w:numId w:val="4"/>
+        </w:numPr>
+        <w:rPr>
+          <w:color w:val="0D0D0D" w:themeColor="text1" w:themeTint="F2"/>
+        </w:rPr>
+      </w:pPr>
+      <w:r>
+        <w:rPr>
+          <w:color w:val="0D0D0D" w:themeColor="text1" w:themeTint="F2"/>
+        </w:rPr>
+        <w:t>Configuración</w:t>
+      </w:r>
+    </w:p>
+    <w:p>
+      <w:pPr>
+        <w:ind w:left="360"/>
+      </w:pPr>
+      <w:r>
+        <w:drawing>
+          <wp:inline distT="0" distB="0" distL="0" distR="0" wp14:anchorId="0D48D65E" wp14:editId="1DA0FB0B">
+            <wp:extent cx="3799703" cy="2458815"/>
+            <wp:effectExtent l="0" t="0" r="0" b="0"/>
+            <wp:docPr id="1273400577" name="Imagen 1"/>
+            <wp:cNvGraphicFramePr>
+              <a:graphicFrameLocks xmlns:a="http://schemas.openxmlformats.org/drawingml/2006/main" noChangeAspect="1"/>
+            </wp:cNvGraphicFramePr>
+            <a:graphic xmlns:a="http://schemas.openxmlformats.org/drawingml/2006/main">
+              <a:graphicData uri="http://schemas.openxmlformats.org/drawingml/2006/picture">
+                <pic:pic xmlns:pic="http://schemas.openxmlformats.org/drawingml/2006/picture">
+                  <pic:nvPicPr>
+                    <pic:cNvPr id="1273400577" name=""/>
+                    <pic:cNvPicPr/>
+                  </pic:nvPicPr>
+                  <pic:blipFill>
+                    <a:blip r:embed="rId23"/>
+                    <a:stretch>
+                      <a:fillRect/>
+                    </a:stretch>
+                  </pic:blipFill>
+                  <pic:spPr>
+                    <a:xfrm>
+                      <a:off x="0" y="0"/>
+                      <a:ext cx="3810496" cy="2465799"/>
+                    </a:xfrm>
+                    <a:prstGeom prst="rect">
+                      <a:avLst/>
+                    </a:prstGeom>
+                  </pic:spPr>
+                </pic:pic>
+              </a:graphicData>
+            </a:graphic>
+          </wp:inline>
+        </w:drawing>
+      </w:r>
+    </w:p>
+    <w:p>
+      <w:pPr>
+        <w:ind w:left="360"/>
+      </w:pPr>
+      <w:r>
+        <w:drawing>
+          <wp:inline distT="0" distB="0" distL="0" distR="0" wp14:anchorId="7B09402D" wp14:editId="247A3593">
+            <wp:extent cx="2236573" cy="3761955"/>
+            <wp:effectExtent l="0" t="0" r="0" b="0"/>
+            <wp:docPr id="1465135494" name="Imagen 1"/>
+            <wp:cNvGraphicFramePr>
+              <a:graphicFrameLocks xmlns:a="http://schemas.openxmlformats.org/drawingml/2006/main" noChangeAspect="1"/>
+            </wp:cNvGraphicFramePr>
+            <a:graphic xmlns:a="http://schemas.openxmlformats.org/drawingml/2006/main">
+              <a:graphicData uri="http://schemas.openxmlformats.org/drawingml/2006/picture">
+                <pic:pic xmlns:pic="http://schemas.openxmlformats.org/drawingml/2006/picture">
+                  <pic:nvPicPr>
+                    <pic:cNvPr id="1465135494" name=""/>
+                    <pic:cNvPicPr/>
+                  </pic:nvPicPr>
+                  <pic:blipFill>
+                    <a:blip r:embed="rId24"/>
+                    <a:stretch>
+                      <a:fillRect/>
+                    </a:stretch>
+                  </pic:blipFill>
+                  <pic:spPr>
+                    <a:xfrm>
+                      <a:off x="0" y="0"/>
+                      <a:ext cx="2239092" cy="3766191"/>
+                    </a:xfrm>
+                    <a:prstGeom prst="rect">
+                      <a:avLst/>
+                    </a:prstGeom>
+                  </pic:spPr>
+                </pic:pic>
+              </a:graphicData>
+            </a:graphic>
+          </wp:inline>
+        </w:drawing>
+      </w:r>
+    </w:p>
+    <w:p>
+      <w:pPr>
+        <w:ind w:left="360"/>
+      </w:pPr>
+      <w:r>
+        <w:t xml:space="preserve">Para terminar nuestro boceto, al realizar </w:t>
+      </w:r>
+      <w:proofErr w:type="spellStart"/>
+      <w:proofErr w:type="gramStart"/>
+      <w:r>
+        <w:t>click</w:t>
+      </w:r>
+      <w:proofErr w:type="spellEnd"/>
+      <w:proofErr w:type="gramEnd"/>
+      <w:r>
+        <w:t xml:space="preserve"> en la tuerca en la parte de arriba, se nos abre una nueva pestaña de configuración, la cual tiene varias pestañas que permite cambiar y ajustar el programa al gusto del cliente, ya sea cambiando el aspecto, legibilidad, accesibilidad, uso de notificaciones, </w:t>
+      </w:r>
+      <w:proofErr w:type="spellStart"/>
+      <w:r>
+        <w:t>etc</w:t>
+      </w:r>
+      <w:proofErr w:type="spellEnd"/>
+      <w:r>
+        <w:t>…</w:t>
+      </w:r>
+    </w:p>
+    <w:p>
+      <w:pPr>
+        <w:ind w:left="360"/>
+      </w:pPr>
+      <w:r>
+        <w:lastRenderedPageBreak/>
+        <w:t>Con esto terminaríamos nuestro boceto de baja fidelidad.</w:t>
       </w:r>
     </w:p>
     <w:sectPr>

</xml_diff>